<commit_message>
Fix Word document generation to resolve opening error
- Fixed table handling in markdown to DOCX conversion
- Added proper table row tracking and flushing logic
- Tables now properly wrapped in Table objects
- Added header row styling with gray background
- Fixed table cell width calculations
- Ensured tables are properly closed before other content
- Word document should now open without errors
</commit_message>
<xml_diff>
--- a/docs/USER-JOURNEYS.docx
+++ b/docs/USER-JOURNEYS.docx
@@ -4945,656 +4945,986 @@
         <w:t xml:space="preserve">Key Differences</w:t>
       </w:r>
     </w:p>
-    <w:tr>
-      <w:tc>
-        <w:tcPr>
-          <w:tcW w:type="pct" w:w="25%"/>
-          <w:shd w:fill="FFFFFF"/>
-          <w:vAlign w:val="center"/>
-        </w:tcPr>
-        <w:p>
-          <w:r>
-            <w:rPr>
-              <w:sz w:val="22"/>
-              <w:szCs w:val="22"/>
-            </w:rPr>
-            <w:t xml:space="preserve">Aspect</w:t>
-          </w:r>
-        </w:p>
-      </w:tc>
-      <w:tc>
-        <w:tcPr>
-          <w:tcW w:type="pct" w:w="25%"/>
-          <w:shd w:fill="FFFFFF"/>
-          <w:vAlign w:val="center"/>
-        </w:tcPr>
-        <w:p>
-          <w:r>
-            <w:rPr>
-              <w:sz w:val="22"/>
-              <w:szCs w:val="22"/>
-            </w:rPr>
-            <w:t xml:space="preserve">Consortium Member</w:t>
-          </w:r>
-        </w:p>
-      </w:tc>
-      <w:tc>
-        <w:tcPr>
-          <w:tcW w:type="pct" w:w="25%"/>
-          <w:shd w:fill="FFFFFF"/>
-          <w:vAlign w:val="center"/>
-        </w:tcPr>
-        <w:p>
-          <w:r>
-            <w:rPr>
-              <w:sz w:val="22"/>
-              <w:szCs w:val="22"/>
-            </w:rPr>
-            <w:t xml:space="preserve">Founder Member</w:t>
-          </w:r>
-        </w:p>
-      </w:tc>
-    </w:tr>
-    <w:tr>
-      <w:tc>
-        <w:tcPr>
-          <w:tcW w:type="pct" w:w="25%"/>
-          <w:shd w:fill="FFFFFF"/>
-          <w:vAlign w:val="center"/>
-        </w:tcPr>
-        <w:p>
-          <w:r>
-            <w:rPr>
-              <w:sz w:val="22"/>
-              <w:szCs w:val="22"/>
-            </w:rPr>
-            <w:t xml:space="preserve">**Entry Point**</w:t>
-          </w:r>
-        </w:p>
-      </w:tc>
-      <w:tc>
-        <w:tcPr>
-          <w:tcW w:type="pct" w:w="25%"/>
-          <w:shd w:fill="FFFFFF"/>
-          <w:vAlign w:val="center"/>
-        </w:tcPr>
-        <w:p>
-          <w:r>
-            <w:rPr>
-              <w:sz w:val="22"/>
-              <w:szCs w:val="22"/>
-            </w:rPr>
-            <w:t xml:space="preserve">Public signup via marketing page</w:t>
-          </w:r>
-        </w:p>
-      </w:tc>
-      <w:tc>
-        <w:tcPr>
-          <w:tcW w:type="pct" w:w="25%"/>
-          <w:shd w:fill="FFFFFF"/>
-          <w:vAlign w:val="center"/>
-        </w:tcPr>
-        <w:p>
-          <w:r>
-            <w:rPr>
-              <w:sz w:val="22"/>
-              <w:szCs w:val="22"/>
-            </w:rPr>
-            <w:t xml:space="preserve">Invitation from KDM leadership</w:t>
-          </w:r>
-        </w:p>
-      </w:tc>
-    </w:tr>
-    <w:tr>
-      <w:tc>
-        <w:tcPr>
-          <w:tcW w:type="pct" w:w="25%"/>
-          <w:shd w:fill="FFFFFF"/>
-          <w:vAlign w:val="center"/>
-        </w:tcPr>
-        <w:p>
-          <w:r>
-            <w:rPr>
-              <w:sz w:val="22"/>
-              <w:szCs w:val="22"/>
-            </w:rPr>
-            <w:t xml:space="preserve">**Collection**</w:t>
-          </w:r>
-        </w:p>
-      </w:tc>
-      <w:tc>
-        <w:tcPr>
-          <w:tcW w:type="pct" w:w="25%"/>
-          <w:shd w:fill="FFFFFF"/>
-          <w:vAlign w:val="center"/>
-        </w:tcPr>
-        <w:p>
-          <w:r>
-            <w:rPr>
-              <w:sz w:val="22"/>
-              <w:szCs w:val="22"/>
-            </w:rPr>
-            <w:t xml:space="preserve">`consortiumMembers`</w:t>
-          </w:r>
-        </w:p>
-      </w:tc>
-      <w:tc>
-        <w:tcPr>
-          <w:tcW w:type="pct" w:w="25%"/>
-          <w:shd w:fill="FFFFFF"/>
-          <w:vAlign w:val="center"/>
-        </w:tcPr>
-        <w:p>
-          <w:r>
-            <w:rPr>
-              <w:sz w:val="22"/>
-              <w:szCs w:val="22"/>
-            </w:rPr>
-            <w:t xml:space="preserve">`teamMembers` (with "founder" tag)</w:t>
-          </w:r>
-        </w:p>
-      </w:tc>
-    </w:tr>
-    <w:tr>
-      <w:tc>
-        <w:tcPr>
-          <w:tcW w:type="pct" w:w="25%"/>
-          <w:shd w:fill="FFFFFF"/>
-          <w:vAlign w:val="center"/>
-        </w:tcPr>
-        <w:p>
-          <w:r>
-            <w:rPr>
-              <w:sz w:val="22"/>
-              <w:szCs w:val="22"/>
-            </w:rPr>
-            <w:t xml:space="preserve">**Membership Type**</w:t>
-          </w:r>
-        </w:p>
-      </w:tc>
-      <w:tc>
-        <w:tcPr>
-          <w:tcW w:type="pct" w:w="25%"/>
-          <w:shd w:fill="FFFFFF"/>
-          <w:vAlign w:val="center"/>
-        </w:tcPr>
-        <w:p>
-          <w:r>
-            <w:rPr>
-              <w:sz w:val="22"/>
-              <w:szCs w:val="22"/>
-            </w:rPr>
-            <w:t xml:space="preserve">Subscription-based (paid tiers)</w:t>
-          </w:r>
-        </w:p>
-      </w:tc>
-      <w:tc>
-        <w:tcPr>
-          <w:tcW w:type="pct" w:w="25%"/>
-          <w:shd w:fill="FFFFFF"/>
-          <w:vAlign w:val="center"/>
-        </w:tcPr>
-        <w:p>
-          <w:r>
-            <w:rPr>
-              <w:sz w:val="22"/>
-              <w:szCs w:val="22"/>
-            </w:rPr>
-            <w:t xml:space="preserve">Partnership/equity-based</w:t>
-          </w:r>
-        </w:p>
-      </w:tc>
-    </w:tr>
-    <w:tr>
-      <w:tc>
-        <w:tcPr>
-          <w:tcW w:type="pct" w:w="25%"/>
-          <w:shd w:fill="FFFFFF"/>
-          <w:vAlign w:val="center"/>
-        </w:tcPr>
-        <w:p>
-          <w:r>
-            <w:rPr>
-              <w:sz w:val="22"/>
-              <w:szCs w:val="22"/>
-            </w:rPr>
-            <w:t xml:space="preserve">**Onboarding Focus**</w:t>
-          </w:r>
-        </w:p>
-      </w:tc>
-      <w:tc>
-        <w:tcPr>
-          <w:tcW w:type="pct" w:w="25%"/>
-          <w:shd w:fill="FFFFFF"/>
-          <w:vAlign w:val="center"/>
-        </w:tcPr>
-        <w:p>
-          <w:r>
-            <w:rPr>
-              <w:sz w:val="22"/>
-              <w:szCs w:val="22"/>
-            </w:rPr>
-            <w:t xml:space="preserve">Consortium-specific, marketplace, government contracting</w:t>
-          </w:r>
-        </w:p>
-      </w:tc>
-      <w:tc>
-        <w:tcPr>
-          <w:tcW w:type="pct" w:w="25%"/>
-          <w:shd w:fill="FFFFFF"/>
-          <w:vAlign w:val="center"/>
-        </w:tcPr>
-        <w:p>
-          <w:r>
-            <w:rPr>
-              <w:sz w:val="22"/>
-              <w:szCs w:val="22"/>
-            </w:rPr>
-            <w:t xml:space="preserve">Team/affiliate onboarding</w:t>
-          </w:r>
-        </w:p>
-      </w:tc>
-    </w:tr>
-    <w:tr>
-      <w:tc>
-        <w:tcPr>
-          <w:tcW w:type="pct" w:w="25%"/>
-          <w:shd w:fill="FFFFFF"/>
-          <w:vAlign w:val="center"/>
-        </w:tcPr>
-        <w:p>
-          <w:r>
-            <w:rPr>
-              <w:sz w:val="22"/>
-              <w:szCs w:val="22"/>
-            </w:rPr>
-            <w:t xml:space="preserve">**Primary Dashboard**</w:t>
-          </w:r>
-        </w:p>
-      </w:tc>
-      <w:tc>
-        <w:tcPr>
-          <w:tcW w:type="pct" w:w="25%"/>
-          <w:shd w:fill="FFFFFF"/>
-          <w:vAlign w:val="center"/>
-        </w:tcPr>
-        <w:p>
-          <w:r>
-            <w:rPr>
-              <w:sz w:val="22"/>
-              <w:szCs w:val="22"/>
-            </w:rPr>
-            <w:t xml:space="preserve">`/portal/consortium`</w:t>
-          </w:r>
-        </w:p>
-      </w:tc>
-      <w:tc>
-        <w:tcPr>
-          <w:tcW w:type="pct" w:w="25%"/>
-          <w:shd w:fill="FFFFFF"/>
-          <w:vAlign w:val="center"/>
-        </w:tcPr>
-        <w:p>
-          <w:r>
-            <w:rPr>
-              <w:sz w:val="22"/>
-              <w:szCs w:val="22"/>
-            </w:rPr>
-            <w:t xml:space="preserve">`/portal/team`</w:t>
-          </w:r>
-        </w:p>
-      </w:tc>
-    </w:tr>
-    <w:tr>
-      <w:tc>
-        <w:tcPr>
-          <w:tcW w:type="pct" w:w="25%"/>
-          <w:shd w:fill="FFFFFF"/>
-          <w:vAlign w:val="center"/>
-        </w:tcPr>
-        <w:p>
-          <w:r>
-            <w:rPr>
-              <w:sz w:val="22"/>
-              <w:szCs w:val="22"/>
-            </w:rPr>
-            <w:t xml:space="preserve">**Marketplace Access**</w:t>
-          </w:r>
-        </w:p>
-      </w:tc>
-      <w:tc>
-        <w:tcPr>
-          <w:tcW w:type="pct" w:w="25%"/>
-          <w:shd w:fill="FFFFFF"/>
-          <w:vAlign w:val="center"/>
-        </w:tcPr>
-        <w:p>
-          <w:r>
-            <w:rPr>
-              <w:sz w:val="22"/>
-              <w:szCs w:val="22"/>
-            </w:rPr>
-            <w:t xml:space="preserve">Can create and browse listings</w:t>
-          </w:r>
-        </w:p>
-      </w:tc>
-      <w:tc>
-        <w:tcPr>
-          <w:tcW w:type="pct" w:w="25%"/>
-          <w:shd w:fill="FFFFFF"/>
-          <w:vAlign w:val="center"/>
-        </w:tcPr>
-        <w:p>
-          <w:r>
-            <w:rPr>
-              <w:sz w:val="22"/>
-              <w:szCs w:val="22"/>
-            </w:rPr>
-            <w:t xml:space="preserve">Oversight role, can review activity</w:t>
-          </w:r>
-        </w:p>
-      </w:tc>
-    </w:tr>
-    <w:tr>
-      <w:tc>
-        <w:tcPr>
-          <w:tcW w:type="pct" w:w="25%"/>
-          <w:shd w:fill="FFFFFF"/>
-          <w:vAlign w:val="center"/>
-        </w:tcPr>
-        <w:p>
-          <w:r>
-            <w:rPr>
-              <w:sz w:val="22"/>
-              <w:szCs w:val="22"/>
-            </w:rPr>
-            <w:t xml:space="preserve">**Opportunity Search**</w:t>
-          </w:r>
-        </w:p>
-      </w:tc>
-      <w:tc>
-        <w:tcPr>
-          <w:tcW w:type="pct" w:w="25%"/>
-          <w:shd w:fill="FFFFFF"/>
-          <w:vAlign w:val="center"/>
-        </w:tcPr>
-        <w:p>
-          <w:r>
-            <w:rPr>
-              <w:sz w:val="22"/>
-              <w:szCs w:val="22"/>
-            </w:rPr>
-            <w:t xml:space="preserve">Full access to AI-powered SAM.gov search</w:t>
-          </w:r>
-        </w:p>
-      </w:tc>
-      <w:tc>
-        <w:tcPr>
-          <w:tcW w:type="pct" w:w="25%"/>
-          <w:shd w:fill="FFFFFF"/>
-          <w:vAlign w:val="center"/>
-        </w:tcPr>
-        <w:p>
-          <w:r>
-            <w:rPr>
-              <w:sz w:val="22"/>
-              <w:szCs w:val="22"/>
-            </w:rPr>
-            <w:t xml:space="preserve">Oversight access</w:t>
-          </w:r>
-        </w:p>
-      </w:tc>
-    </w:tr>
-    <w:tr>
-      <w:tc>
-        <w:tcPr>
-          <w:tcW w:type="pct" w:w="25%"/>
-          <w:shd w:fill="FFFFFF"/>
-          <w:vAlign w:val="center"/>
-        </w:tcPr>
-        <w:p>
-          <w:r>
-            <w:rPr>
-              <w:sz w:val="22"/>
-              <w:szCs w:val="22"/>
-            </w:rPr>
-            <w:t xml:space="preserve">**Admin Access**</w:t>
-          </w:r>
-        </w:p>
-      </w:tc>
-      <w:tc>
-        <w:tcPr>
-          <w:tcW w:type="pct" w:w="25%"/>
-          <w:shd w:fill="FFFFFF"/>
-          <w:vAlign w:val="center"/>
-        </w:tcPr>
-        <w:p>
-          <w:r>
-            <w:rPr>
-              <w:sz w:val="22"/>
-              <w:szCs w:val="22"/>
-            </w:rPr>
-            <w:t xml:space="preserve">Limited to own listings/profile</w:t>
-          </w:r>
-        </w:p>
-      </w:tc>
-      <w:tc>
-        <w:tcPr>
-          <w:tcW w:type="pct" w:w="25%"/>
-          <w:shd w:fill="FFFFFF"/>
-          <w:vAlign w:val="center"/>
-        </w:tcPr>
-        <w:p>
-          <w:r>
-            <w:rPr>
-              <w:sz w:val="22"/>
-              <w:szCs w:val="22"/>
-            </w:rPr>
-            <w:t xml:space="preserve">Full admin panel access</w:t>
-          </w:r>
-        </w:p>
-      </w:tc>
-    </w:tr>
-    <w:tr>
-      <w:tc>
-        <w:tcPr>
-          <w:tcW w:type="pct" w:w="25%"/>
-          <w:shd w:fill="FFFFFF"/>
-          <w:vAlign w:val="center"/>
-        </w:tcPr>
-        <w:p>
-          <w:r>
-            <w:rPr>
-              <w:sz w:val="22"/>
-              <w:szCs w:val="22"/>
-            </w:rPr>
-            <w:t xml:space="preserve">**Networking**</w:t>
-          </w:r>
-        </w:p>
-      </w:tc>
-      <w:tc>
-        <w:tcPr>
-          <w:tcW w:type="pct" w:w="25%"/>
-          <w:shd w:fill="FFFFFF"/>
-          <w:vAlign w:val="center"/>
-        </w:tcPr>
-        <w:p>
-          <w:r>
-            <w:rPr>
-              <w:sz w:val="22"/>
-              <w:szCs w:val="22"/>
-            </w:rPr>
-            <w:t xml:space="preserve">Consortium member directory</w:t>
-          </w:r>
-        </w:p>
-      </w:tc>
-      <w:tc>
-        <w:tcPr>
-          <w:tcW w:type="pct" w:w="25%"/>
-          <w:shd w:fill="FFFFFF"/>
-          <w:vAlign w:val="center"/>
-        </w:tcPr>
-        <w:p>
-          <w:r>
-            <w:rPr>
-              <w:sz w:val="22"/>
-              <w:szCs w:val="22"/>
-            </w:rPr>
-            <w:t xml:space="preserve">Affiliate networking + team management</w:t>
-          </w:r>
-        </w:p>
-      </w:tc>
-    </w:tr>
-    <w:tr>
-      <w:tc>
-        <w:tcPr>
-          <w:tcW w:type="pct" w:w="25%"/>
-          <w:shd w:fill="FFFFFF"/>
-          <w:vAlign w:val="center"/>
-        </w:tcPr>
-        <w:p>
-          <w:r>
-            <w:rPr>
-              <w:sz w:val="22"/>
-              <w:szCs w:val="22"/>
-            </w:rPr>
-            <w:t xml:space="preserve">**Pricing**</w:t>
-          </w:r>
-        </w:p>
-      </w:tc>
-      <w:tc>
-        <w:tcPr>
-          <w:tcW w:type="pct" w:w="25%"/>
-          <w:shd w:fill="FFFFFF"/>
-          <w:vAlign w:val="center"/>
-        </w:tcPr>
-        <w:p>
-          <w:r>
-            <w:rPr>
-              <w:sz w:val="22"/>
-              <w:szCs w:val="22"/>
-            </w:rPr>
-            <w:t xml:space="preserve">Monthly/annual subscription fees</w:t>
-          </w:r>
-        </w:p>
-      </w:tc>
-      <w:tc>
-        <w:tcPr>
-          <w:tcW w:type="pct" w:w="25%"/>
-          <w:shd w:fill="FFFFFF"/>
-          <w:vAlign w:val="center"/>
-        </w:tcPr>
-        <w:p>
-          <w:r>
-            <w:rPr>
-              <w:sz w:val="22"/>
-              <w:szCs w:val="22"/>
-            </w:rPr>
-            <w:t xml:space="preserve">No subscription (founder status)</w:t>
-          </w:r>
-        </w:p>
-      </w:tc>
-    </w:tr>
-    <w:tr>
-      <w:tc>
-        <w:tcPr>
-          <w:tcW w:type="pct" w:w="25%"/>
-          <w:shd w:fill="FFFFFF"/>
-          <w:vAlign w:val="center"/>
-        </w:tcPr>
-        <w:p>
-          <w:r>
-            <w:rPr>
-              <w:sz w:val="22"/>
-              <w:szCs w:val="22"/>
-            </w:rPr>
-            <w:t xml:space="preserve">**Member Management**</w:t>
-          </w:r>
-        </w:p>
-      </w:tc>
-      <w:tc>
-        <w:tcPr>
-          <w:tcW w:type="pct" w:w="25%"/>
-          <w:shd w:fill="FFFFFF"/>
-          <w:vAlign w:val="center"/>
-        </w:tcPr>
-        <w:p>
-          <w:r>
-            <w:rPr>
-              <w:sz w:val="22"/>
-              <w:szCs w:val="22"/>
-            </w:rPr>
-            <w:t xml:space="preserve">Cannot manage other members</w:t>
-          </w:r>
-        </w:p>
-      </w:tc>
-      <w:tc>
-        <w:tcPr>
-          <w:tcW w:type="pct" w:w="25%"/>
-          <w:shd w:fill="FFFFFF"/>
-          <w:vAlign w:val="center"/>
-        </w:tcPr>
-        <w:p>
-          <w:r>
-            <w:rPr>
-              <w:sz w:val="22"/>
-              <w:szCs w:val="22"/>
-            </w:rPr>
-            <w:t xml:space="preserve">Can manage consortium members</w:t>
-          </w:r>
-        </w:p>
-      </w:tc>
-    </w:tr>
-    <w:tr>
-      <w:tc>
-        <w:tcPr>
-          <w:tcW w:type="pct" w:w="25%"/>
-          <w:shd w:fill="FFFFFF"/>
-          <w:vAlign w:val="center"/>
-        </w:tcPr>
-        <w:p>
-          <w:r>
-            <w:rPr>
-              <w:sz w:val="22"/>
-              <w:szCs w:val="22"/>
-            </w:rPr>
-            <w:t xml:space="preserve">**Support**</w:t>
-          </w:r>
-        </w:p>
-      </w:tc>
-      <w:tc>
-        <w:tcPr>
-          <w:tcW w:type="pct" w:w="25%"/>
-          <w:shd w:fill="FFFFFF"/>
-          <w:vAlign w:val="center"/>
-        </w:tcPr>
-        <w:p>
-          <w:r>
-            <w:rPr>
-              <w:sz w:val="22"/>
-              <w:szCs w:val="22"/>
-            </w:rPr>
-            <w:t xml:space="preserve">General consortium support</w:t>
-          </w:r>
-        </w:p>
-      </w:tc>
-      <w:tc>
-        <w:tcPr>
-          <w:tcW w:type="pct" w:w="25%"/>
-          <w:shd w:fill="FFFFFF"/>
-          <w:vAlign w:val="center"/>
-        </w:tcPr>
-        <w:p>
-          <w:r>
-            <w:rPr>
-              <w:sz w:val="22"/>
-              <w:szCs w:val="22"/>
-            </w:rPr>
-            <w:t xml:space="preserve">Founder-specific support</w:t>
-          </w:r>
-        </w:p>
-      </w:tc>
-    </w:tr>
+    <w:tbl>
+      <w:tblPr>
+        <w:tblW w:type="pct" w:w="100%"/>
+        <w:tblBorders>
+          <w:top w:val="single" w:color="auto" w:sz="4"/>
+          <w:left w:val="single" w:color="auto" w:sz="4"/>
+          <w:bottom w:val="single" w:color="auto" w:sz="4"/>
+          <w:right w:val="single" w:color="auto" w:sz="4"/>
+          <w:insideH w:val="single" w:color="auto" w:sz="4"/>
+          <w:insideV w:val="single" w:color="auto" w:sz="4"/>
+        </w:tblBorders>
+      </w:tblPr>
+      <w:tblGrid>
+        <w:gridCol w:w="100"/>
+        <w:gridCol w:w="100"/>
+        <w:gridCol w:w="100"/>
+      </w:tblGrid>
+      <w:tr>
+        <w:tc>
+          <w:tcPr>
+            <w:tcW w:type="pct" w:w="33.333333333333336%"/>
+            <w:shd w:fill="E8E8E8"/>
+            <w:tcMar>
+              <w:top w:type="dxa" w:w="100"/>
+              <w:left w:type="dxa" w:w="100"/>
+              <w:bottom w:type="dxa" w:w="100"/>
+              <w:right w:type="dxa" w:w="100"/>
+            </w:tcMar>
+            <w:vAlign w:val="center"/>
+          </w:tcPr>
+          <w:p>
+            <w:r>
+              <w:rPr>
+                <w:b/>
+                <w:bCs/>
+                <w:sz w:val="22"/>
+                <w:szCs w:val="22"/>
+              </w:rPr>
+              <w:t xml:space="preserve">Aspect</w:t>
+            </w:r>
+          </w:p>
+        </w:tc>
+        <w:tc>
+          <w:tcPr>
+            <w:tcW w:type="pct" w:w="33.333333333333336%"/>
+            <w:shd w:fill="E8E8E8"/>
+            <w:tcMar>
+              <w:top w:type="dxa" w:w="100"/>
+              <w:left w:type="dxa" w:w="100"/>
+              <w:bottom w:type="dxa" w:w="100"/>
+              <w:right w:type="dxa" w:w="100"/>
+            </w:tcMar>
+            <w:vAlign w:val="center"/>
+          </w:tcPr>
+          <w:p>
+            <w:r>
+              <w:rPr>
+                <w:b/>
+                <w:bCs/>
+                <w:sz w:val="22"/>
+                <w:szCs w:val="22"/>
+              </w:rPr>
+              <w:t xml:space="preserve">Consortium Member</w:t>
+            </w:r>
+          </w:p>
+        </w:tc>
+        <w:tc>
+          <w:tcPr>
+            <w:tcW w:type="pct" w:w="33.333333333333336%"/>
+            <w:shd w:fill="E8E8E8"/>
+            <w:tcMar>
+              <w:top w:type="dxa" w:w="100"/>
+              <w:left w:type="dxa" w:w="100"/>
+              <w:bottom w:type="dxa" w:w="100"/>
+              <w:right w:type="dxa" w:w="100"/>
+            </w:tcMar>
+            <w:vAlign w:val="center"/>
+          </w:tcPr>
+          <w:p>
+            <w:r>
+              <w:rPr>
+                <w:b/>
+                <w:bCs/>
+                <w:sz w:val="22"/>
+                <w:szCs w:val="22"/>
+              </w:rPr>
+              <w:t xml:space="preserve">Founder Member</w:t>
+            </w:r>
+          </w:p>
+        </w:tc>
+      </w:tr>
+      <w:tr>
+        <w:tc>
+          <w:tcPr>
+            <w:tcW w:type="pct" w:w="33.333333333333336%"/>
+            <w:shd w:fill="FFFFFF"/>
+            <w:tcMar>
+              <w:top w:type="dxa" w:w="100"/>
+              <w:left w:type="dxa" w:w="100"/>
+              <w:bottom w:type="dxa" w:w="100"/>
+              <w:right w:type="dxa" w:w="100"/>
+            </w:tcMar>
+            <w:vAlign w:val="center"/>
+          </w:tcPr>
+          <w:p>
+            <w:r>
+              <w:rPr>
+                <w:b w:val="false"/>
+                <w:bCs w:val="false"/>
+                <w:sz w:val="22"/>
+                <w:szCs w:val="22"/>
+              </w:rPr>
+              <w:t xml:space="preserve">**Entry Point**</w:t>
+            </w:r>
+          </w:p>
+        </w:tc>
+        <w:tc>
+          <w:tcPr>
+            <w:tcW w:type="pct" w:w="33.333333333333336%"/>
+            <w:shd w:fill="FFFFFF"/>
+            <w:tcMar>
+              <w:top w:type="dxa" w:w="100"/>
+              <w:left w:type="dxa" w:w="100"/>
+              <w:bottom w:type="dxa" w:w="100"/>
+              <w:right w:type="dxa" w:w="100"/>
+            </w:tcMar>
+            <w:vAlign w:val="center"/>
+          </w:tcPr>
+          <w:p>
+            <w:r>
+              <w:rPr>
+                <w:b w:val="false"/>
+                <w:bCs w:val="false"/>
+                <w:sz w:val="22"/>
+                <w:szCs w:val="22"/>
+              </w:rPr>
+              <w:t xml:space="preserve">Public signup via marketing page</w:t>
+            </w:r>
+          </w:p>
+        </w:tc>
+        <w:tc>
+          <w:tcPr>
+            <w:tcW w:type="pct" w:w="33.333333333333336%"/>
+            <w:shd w:fill="FFFFFF"/>
+            <w:tcMar>
+              <w:top w:type="dxa" w:w="100"/>
+              <w:left w:type="dxa" w:w="100"/>
+              <w:bottom w:type="dxa" w:w="100"/>
+              <w:right w:type="dxa" w:w="100"/>
+            </w:tcMar>
+            <w:vAlign w:val="center"/>
+          </w:tcPr>
+          <w:p>
+            <w:r>
+              <w:rPr>
+                <w:b w:val="false"/>
+                <w:bCs w:val="false"/>
+                <w:sz w:val="22"/>
+                <w:szCs w:val="22"/>
+              </w:rPr>
+              <w:t xml:space="preserve">Invitation from KDM leadership</w:t>
+            </w:r>
+          </w:p>
+        </w:tc>
+      </w:tr>
+      <w:tr>
+        <w:tc>
+          <w:tcPr>
+            <w:tcW w:type="pct" w:w="33.333333333333336%"/>
+            <w:shd w:fill="FFFFFF"/>
+            <w:tcMar>
+              <w:top w:type="dxa" w:w="100"/>
+              <w:left w:type="dxa" w:w="100"/>
+              <w:bottom w:type="dxa" w:w="100"/>
+              <w:right w:type="dxa" w:w="100"/>
+            </w:tcMar>
+            <w:vAlign w:val="center"/>
+          </w:tcPr>
+          <w:p>
+            <w:r>
+              <w:rPr>
+                <w:b w:val="false"/>
+                <w:bCs w:val="false"/>
+                <w:sz w:val="22"/>
+                <w:szCs w:val="22"/>
+              </w:rPr>
+              <w:t xml:space="preserve">**Collection**</w:t>
+            </w:r>
+          </w:p>
+        </w:tc>
+        <w:tc>
+          <w:tcPr>
+            <w:tcW w:type="pct" w:w="33.333333333333336%"/>
+            <w:shd w:fill="FFFFFF"/>
+            <w:tcMar>
+              <w:top w:type="dxa" w:w="100"/>
+              <w:left w:type="dxa" w:w="100"/>
+              <w:bottom w:type="dxa" w:w="100"/>
+              <w:right w:type="dxa" w:w="100"/>
+            </w:tcMar>
+            <w:vAlign w:val="center"/>
+          </w:tcPr>
+          <w:p>
+            <w:r>
+              <w:rPr>
+                <w:b w:val="false"/>
+                <w:bCs w:val="false"/>
+                <w:sz w:val="22"/>
+                <w:szCs w:val="22"/>
+              </w:rPr>
+              <w:t xml:space="preserve">`consortiumMembers`</w:t>
+            </w:r>
+          </w:p>
+        </w:tc>
+        <w:tc>
+          <w:tcPr>
+            <w:tcW w:type="pct" w:w="33.333333333333336%"/>
+            <w:shd w:fill="FFFFFF"/>
+            <w:tcMar>
+              <w:top w:type="dxa" w:w="100"/>
+              <w:left w:type="dxa" w:w="100"/>
+              <w:bottom w:type="dxa" w:w="100"/>
+              <w:right w:type="dxa" w:w="100"/>
+            </w:tcMar>
+            <w:vAlign w:val="center"/>
+          </w:tcPr>
+          <w:p>
+            <w:r>
+              <w:rPr>
+                <w:b w:val="false"/>
+                <w:bCs w:val="false"/>
+                <w:sz w:val="22"/>
+                <w:szCs w:val="22"/>
+              </w:rPr>
+              <w:t xml:space="preserve">`teamMembers` (with "founder" tag)</w:t>
+            </w:r>
+          </w:p>
+        </w:tc>
+      </w:tr>
+      <w:tr>
+        <w:tc>
+          <w:tcPr>
+            <w:tcW w:type="pct" w:w="33.333333333333336%"/>
+            <w:shd w:fill="FFFFFF"/>
+            <w:tcMar>
+              <w:top w:type="dxa" w:w="100"/>
+              <w:left w:type="dxa" w:w="100"/>
+              <w:bottom w:type="dxa" w:w="100"/>
+              <w:right w:type="dxa" w:w="100"/>
+            </w:tcMar>
+            <w:vAlign w:val="center"/>
+          </w:tcPr>
+          <w:p>
+            <w:r>
+              <w:rPr>
+                <w:b w:val="false"/>
+                <w:bCs w:val="false"/>
+                <w:sz w:val="22"/>
+                <w:szCs w:val="22"/>
+              </w:rPr>
+              <w:t xml:space="preserve">**Membership Type**</w:t>
+            </w:r>
+          </w:p>
+        </w:tc>
+        <w:tc>
+          <w:tcPr>
+            <w:tcW w:type="pct" w:w="33.333333333333336%"/>
+            <w:shd w:fill="FFFFFF"/>
+            <w:tcMar>
+              <w:top w:type="dxa" w:w="100"/>
+              <w:left w:type="dxa" w:w="100"/>
+              <w:bottom w:type="dxa" w:w="100"/>
+              <w:right w:type="dxa" w:w="100"/>
+            </w:tcMar>
+            <w:vAlign w:val="center"/>
+          </w:tcPr>
+          <w:p>
+            <w:r>
+              <w:rPr>
+                <w:b w:val="false"/>
+                <w:bCs w:val="false"/>
+                <w:sz w:val="22"/>
+                <w:szCs w:val="22"/>
+              </w:rPr>
+              <w:t xml:space="preserve">Subscription-based (paid tiers)</w:t>
+            </w:r>
+          </w:p>
+        </w:tc>
+        <w:tc>
+          <w:tcPr>
+            <w:tcW w:type="pct" w:w="33.333333333333336%"/>
+            <w:shd w:fill="FFFFFF"/>
+            <w:tcMar>
+              <w:top w:type="dxa" w:w="100"/>
+              <w:left w:type="dxa" w:w="100"/>
+              <w:bottom w:type="dxa" w:w="100"/>
+              <w:right w:type="dxa" w:w="100"/>
+            </w:tcMar>
+            <w:vAlign w:val="center"/>
+          </w:tcPr>
+          <w:p>
+            <w:r>
+              <w:rPr>
+                <w:b w:val="false"/>
+                <w:bCs w:val="false"/>
+                <w:sz w:val="22"/>
+                <w:szCs w:val="22"/>
+              </w:rPr>
+              <w:t xml:space="preserve">Partnership/equity-based</w:t>
+            </w:r>
+          </w:p>
+        </w:tc>
+      </w:tr>
+      <w:tr>
+        <w:tc>
+          <w:tcPr>
+            <w:tcW w:type="pct" w:w="33.333333333333336%"/>
+            <w:shd w:fill="FFFFFF"/>
+            <w:tcMar>
+              <w:top w:type="dxa" w:w="100"/>
+              <w:left w:type="dxa" w:w="100"/>
+              <w:bottom w:type="dxa" w:w="100"/>
+              <w:right w:type="dxa" w:w="100"/>
+            </w:tcMar>
+            <w:vAlign w:val="center"/>
+          </w:tcPr>
+          <w:p>
+            <w:r>
+              <w:rPr>
+                <w:b w:val="false"/>
+                <w:bCs w:val="false"/>
+                <w:sz w:val="22"/>
+                <w:szCs w:val="22"/>
+              </w:rPr>
+              <w:t xml:space="preserve">**Onboarding Focus**</w:t>
+            </w:r>
+          </w:p>
+        </w:tc>
+        <w:tc>
+          <w:tcPr>
+            <w:tcW w:type="pct" w:w="33.333333333333336%"/>
+            <w:shd w:fill="FFFFFF"/>
+            <w:tcMar>
+              <w:top w:type="dxa" w:w="100"/>
+              <w:left w:type="dxa" w:w="100"/>
+              <w:bottom w:type="dxa" w:w="100"/>
+              <w:right w:type="dxa" w:w="100"/>
+            </w:tcMar>
+            <w:vAlign w:val="center"/>
+          </w:tcPr>
+          <w:p>
+            <w:r>
+              <w:rPr>
+                <w:b w:val="false"/>
+                <w:bCs w:val="false"/>
+                <w:sz w:val="22"/>
+                <w:szCs w:val="22"/>
+              </w:rPr>
+              <w:t xml:space="preserve">Consortium-specific, marketplace, government contracting</w:t>
+            </w:r>
+          </w:p>
+        </w:tc>
+        <w:tc>
+          <w:tcPr>
+            <w:tcW w:type="pct" w:w="33.333333333333336%"/>
+            <w:shd w:fill="FFFFFF"/>
+            <w:tcMar>
+              <w:top w:type="dxa" w:w="100"/>
+              <w:left w:type="dxa" w:w="100"/>
+              <w:bottom w:type="dxa" w:w="100"/>
+              <w:right w:type="dxa" w:w="100"/>
+            </w:tcMar>
+            <w:vAlign w:val="center"/>
+          </w:tcPr>
+          <w:p>
+            <w:r>
+              <w:rPr>
+                <w:b w:val="false"/>
+                <w:bCs w:val="false"/>
+                <w:sz w:val="22"/>
+                <w:szCs w:val="22"/>
+              </w:rPr>
+              <w:t xml:space="preserve">Team/affiliate onboarding</w:t>
+            </w:r>
+          </w:p>
+        </w:tc>
+      </w:tr>
+      <w:tr>
+        <w:tc>
+          <w:tcPr>
+            <w:tcW w:type="pct" w:w="33.333333333333336%"/>
+            <w:shd w:fill="FFFFFF"/>
+            <w:tcMar>
+              <w:top w:type="dxa" w:w="100"/>
+              <w:left w:type="dxa" w:w="100"/>
+              <w:bottom w:type="dxa" w:w="100"/>
+              <w:right w:type="dxa" w:w="100"/>
+            </w:tcMar>
+            <w:vAlign w:val="center"/>
+          </w:tcPr>
+          <w:p>
+            <w:r>
+              <w:rPr>
+                <w:b w:val="false"/>
+                <w:bCs w:val="false"/>
+                <w:sz w:val="22"/>
+                <w:szCs w:val="22"/>
+              </w:rPr>
+              <w:t xml:space="preserve">**Primary Dashboard**</w:t>
+            </w:r>
+          </w:p>
+        </w:tc>
+        <w:tc>
+          <w:tcPr>
+            <w:tcW w:type="pct" w:w="33.333333333333336%"/>
+            <w:shd w:fill="FFFFFF"/>
+            <w:tcMar>
+              <w:top w:type="dxa" w:w="100"/>
+              <w:left w:type="dxa" w:w="100"/>
+              <w:bottom w:type="dxa" w:w="100"/>
+              <w:right w:type="dxa" w:w="100"/>
+            </w:tcMar>
+            <w:vAlign w:val="center"/>
+          </w:tcPr>
+          <w:p>
+            <w:r>
+              <w:rPr>
+                <w:b w:val="false"/>
+                <w:bCs w:val="false"/>
+                <w:sz w:val="22"/>
+                <w:szCs w:val="22"/>
+              </w:rPr>
+              <w:t xml:space="preserve">`/portal/consortium`</w:t>
+            </w:r>
+          </w:p>
+        </w:tc>
+        <w:tc>
+          <w:tcPr>
+            <w:tcW w:type="pct" w:w="33.333333333333336%"/>
+            <w:shd w:fill="FFFFFF"/>
+            <w:tcMar>
+              <w:top w:type="dxa" w:w="100"/>
+              <w:left w:type="dxa" w:w="100"/>
+              <w:bottom w:type="dxa" w:w="100"/>
+              <w:right w:type="dxa" w:w="100"/>
+            </w:tcMar>
+            <w:vAlign w:val="center"/>
+          </w:tcPr>
+          <w:p>
+            <w:r>
+              <w:rPr>
+                <w:b w:val="false"/>
+                <w:bCs w:val="false"/>
+                <w:sz w:val="22"/>
+                <w:szCs w:val="22"/>
+              </w:rPr>
+              <w:t xml:space="preserve">`/portal/team`</w:t>
+            </w:r>
+          </w:p>
+        </w:tc>
+      </w:tr>
+      <w:tr>
+        <w:tc>
+          <w:tcPr>
+            <w:tcW w:type="pct" w:w="33.333333333333336%"/>
+            <w:shd w:fill="FFFFFF"/>
+            <w:tcMar>
+              <w:top w:type="dxa" w:w="100"/>
+              <w:left w:type="dxa" w:w="100"/>
+              <w:bottom w:type="dxa" w:w="100"/>
+              <w:right w:type="dxa" w:w="100"/>
+            </w:tcMar>
+            <w:vAlign w:val="center"/>
+          </w:tcPr>
+          <w:p>
+            <w:r>
+              <w:rPr>
+                <w:b w:val="false"/>
+                <w:bCs w:val="false"/>
+                <w:sz w:val="22"/>
+                <w:szCs w:val="22"/>
+              </w:rPr>
+              <w:t xml:space="preserve">**Marketplace Access**</w:t>
+            </w:r>
+          </w:p>
+        </w:tc>
+        <w:tc>
+          <w:tcPr>
+            <w:tcW w:type="pct" w:w="33.333333333333336%"/>
+            <w:shd w:fill="FFFFFF"/>
+            <w:tcMar>
+              <w:top w:type="dxa" w:w="100"/>
+              <w:left w:type="dxa" w:w="100"/>
+              <w:bottom w:type="dxa" w:w="100"/>
+              <w:right w:type="dxa" w:w="100"/>
+            </w:tcMar>
+            <w:vAlign w:val="center"/>
+          </w:tcPr>
+          <w:p>
+            <w:r>
+              <w:rPr>
+                <w:b w:val="false"/>
+                <w:bCs w:val="false"/>
+                <w:sz w:val="22"/>
+                <w:szCs w:val="22"/>
+              </w:rPr>
+              <w:t xml:space="preserve">Can create and browse listings</w:t>
+            </w:r>
+          </w:p>
+        </w:tc>
+        <w:tc>
+          <w:tcPr>
+            <w:tcW w:type="pct" w:w="33.333333333333336%"/>
+            <w:shd w:fill="FFFFFF"/>
+            <w:tcMar>
+              <w:top w:type="dxa" w:w="100"/>
+              <w:left w:type="dxa" w:w="100"/>
+              <w:bottom w:type="dxa" w:w="100"/>
+              <w:right w:type="dxa" w:w="100"/>
+            </w:tcMar>
+            <w:vAlign w:val="center"/>
+          </w:tcPr>
+          <w:p>
+            <w:r>
+              <w:rPr>
+                <w:b w:val="false"/>
+                <w:bCs w:val="false"/>
+                <w:sz w:val="22"/>
+                <w:szCs w:val="22"/>
+              </w:rPr>
+              <w:t xml:space="preserve">Oversight role, can review activity</w:t>
+            </w:r>
+          </w:p>
+        </w:tc>
+      </w:tr>
+      <w:tr>
+        <w:tc>
+          <w:tcPr>
+            <w:tcW w:type="pct" w:w="33.333333333333336%"/>
+            <w:shd w:fill="FFFFFF"/>
+            <w:tcMar>
+              <w:top w:type="dxa" w:w="100"/>
+              <w:left w:type="dxa" w:w="100"/>
+              <w:bottom w:type="dxa" w:w="100"/>
+              <w:right w:type="dxa" w:w="100"/>
+            </w:tcMar>
+            <w:vAlign w:val="center"/>
+          </w:tcPr>
+          <w:p>
+            <w:r>
+              <w:rPr>
+                <w:b w:val="false"/>
+                <w:bCs w:val="false"/>
+                <w:sz w:val="22"/>
+                <w:szCs w:val="22"/>
+              </w:rPr>
+              <w:t xml:space="preserve">**Opportunity Search**</w:t>
+            </w:r>
+          </w:p>
+        </w:tc>
+        <w:tc>
+          <w:tcPr>
+            <w:tcW w:type="pct" w:w="33.333333333333336%"/>
+            <w:shd w:fill="FFFFFF"/>
+            <w:tcMar>
+              <w:top w:type="dxa" w:w="100"/>
+              <w:left w:type="dxa" w:w="100"/>
+              <w:bottom w:type="dxa" w:w="100"/>
+              <w:right w:type="dxa" w:w="100"/>
+            </w:tcMar>
+            <w:vAlign w:val="center"/>
+          </w:tcPr>
+          <w:p>
+            <w:r>
+              <w:rPr>
+                <w:b w:val="false"/>
+                <w:bCs w:val="false"/>
+                <w:sz w:val="22"/>
+                <w:szCs w:val="22"/>
+              </w:rPr>
+              <w:t xml:space="preserve">Full access to AI-powered SAM.gov search</w:t>
+            </w:r>
+          </w:p>
+        </w:tc>
+        <w:tc>
+          <w:tcPr>
+            <w:tcW w:type="pct" w:w="33.333333333333336%"/>
+            <w:shd w:fill="FFFFFF"/>
+            <w:tcMar>
+              <w:top w:type="dxa" w:w="100"/>
+              <w:left w:type="dxa" w:w="100"/>
+              <w:bottom w:type="dxa" w:w="100"/>
+              <w:right w:type="dxa" w:w="100"/>
+            </w:tcMar>
+            <w:vAlign w:val="center"/>
+          </w:tcPr>
+          <w:p>
+            <w:r>
+              <w:rPr>
+                <w:b w:val="false"/>
+                <w:bCs w:val="false"/>
+                <w:sz w:val="22"/>
+                <w:szCs w:val="22"/>
+              </w:rPr>
+              <w:t xml:space="preserve">Oversight access</w:t>
+            </w:r>
+          </w:p>
+        </w:tc>
+      </w:tr>
+      <w:tr>
+        <w:tc>
+          <w:tcPr>
+            <w:tcW w:type="pct" w:w="33.333333333333336%"/>
+            <w:shd w:fill="FFFFFF"/>
+            <w:tcMar>
+              <w:top w:type="dxa" w:w="100"/>
+              <w:left w:type="dxa" w:w="100"/>
+              <w:bottom w:type="dxa" w:w="100"/>
+              <w:right w:type="dxa" w:w="100"/>
+            </w:tcMar>
+            <w:vAlign w:val="center"/>
+          </w:tcPr>
+          <w:p>
+            <w:r>
+              <w:rPr>
+                <w:b w:val="false"/>
+                <w:bCs w:val="false"/>
+                <w:sz w:val="22"/>
+                <w:szCs w:val="22"/>
+              </w:rPr>
+              <w:t xml:space="preserve">**Admin Access**</w:t>
+            </w:r>
+          </w:p>
+        </w:tc>
+        <w:tc>
+          <w:tcPr>
+            <w:tcW w:type="pct" w:w="33.333333333333336%"/>
+            <w:shd w:fill="FFFFFF"/>
+            <w:tcMar>
+              <w:top w:type="dxa" w:w="100"/>
+              <w:left w:type="dxa" w:w="100"/>
+              <w:bottom w:type="dxa" w:w="100"/>
+              <w:right w:type="dxa" w:w="100"/>
+            </w:tcMar>
+            <w:vAlign w:val="center"/>
+          </w:tcPr>
+          <w:p>
+            <w:r>
+              <w:rPr>
+                <w:b w:val="false"/>
+                <w:bCs w:val="false"/>
+                <w:sz w:val="22"/>
+                <w:szCs w:val="22"/>
+              </w:rPr>
+              <w:t xml:space="preserve">Limited to own listings/profile</w:t>
+            </w:r>
+          </w:p>
+        </w:tc>
+        <w:tc>
+          <w:tcPr>
+            <w:tcW w:type="pct" w:w="33.333333333333336%"/>
+            <w:shd w:fill="FFFFFF"/>
+            <w:tcMar>
+              <w:top w:type="dxa" w:w="100"/>
+              <w:left w:type="dxa" w:w="100"/>
+              <w:bottom w:type="dxa" w:w="100"/>
+              <w:right w:type="dxa" w:w="100"/>
+            </w:tcMar>
+            <w:vAlign w:val="center"/>
+          </w:tcPr>
+          <w:p>
+            <w:r>
+              <w:rPr>
+                <w:b w:val="false"/>
+                <w:bCs w:val="false"/>
+                <w:sz w:val="22"/>
+                <w:szCs w:val="22"/>
+              </w:rPr>
+              <w:t xml:space="preserve">Full admin panel access</w:t>
+            </w:r>
+          </w:p>
+        </w:tc>
+      </w:tr>
+      <w:tr>
+        <w:tc>
+          <w:tcPr>
+            <w:tcW w:type="pct" w:w="33.333333333333336%"/>
+            <w:shd w:fill="FFFFFF"/>
+            <w:tcMar>
+              <w:top w:type="dxa" w:w="100"/>
+              <w:left w:type="dxa" w:w="100"/>
+              <w:bottom w:type="dxa" w:w="100"/>
+              <w:right w:type="dxa" w:w="100"/>
+            </w:tcMar>
+            <w:vAlign w:val="center"/>
+          </w:tcPr>
+          <w:p>
+            <w:r>
+              <w:rPr>
+                <w:b w:val="false"/>
+                <w:bCs w:val="false"/>
+                <w:sz w:val="22"/>
+                <w:szCs w:val="22"/>
+              </w:rPr>
+              <w:t xml:space="preserve">**Networking**</w:t>
+            </w:r>
+          </w:p>
+        </w:tc>
+        <w:tc>
+          <w:tcPr>
+            <w:tcW w:type="pct" w:w="33.333333333333336%"/>
+            <w:shd w:fill="FFFFFF"/>
+            <w:tcMar>
+              <w:top w:type="dxa" w:w="100"/>
+              <w:left w:type="dxa" w:w="100"/>
+              <w:bottom w:type="dxa" w:w="100"/>
+              <w:right w:type="dxa" w:w="100"/>
+            </w:tcMar>
+            <w:vAlign w:val="center"/>
+          </w:tcPr>
+          <w:p>
+            <w:r>
+              <w:rPr>
+                <w:b w:val="false"/>
+                <w:bCs w:val="false"/>
+                <w:sz w:val="22"/>
+                <w:szCs w:val="22"/>
+              </w:rPr>
+              <w:t xml:space="preserve">Consortium member directory</w:t>
+            </w:r>
+          </w:p>
+        </w:tc>
+        <w:tc>
+          <w:tcPr>
+            <w:tcW w:type="pct" w:w="33.333333333333336%"/>
+            <w:shd w:fill="FFFFFF"/>
+            <w:tcMar>
+              <w:top w:type="dxa" w:w="100"/>
+              <w:left w:type="dxa" w:w="100"/>
+              <w:bottom w:type="dxa" w:w="100"/>
+              <w:right w:type="dxa" w:w="100"/>
+            </w:tcMar>
+            <w:vAlign w:val="center"/>
+          </w:tcPr>
+          <w:p>
+            <w:r>
+              <w:rPr>
+                <w:b w:val="false"/>
+                <w:bCs w:val="false"/>
+                <w:sz w:val="22"/>
+                <w:szCs w:val="22"/>
+              </w:rPr>
+              <w:t xml:space="preserve">Affiliate networking + team management</w:t>
+            </w:r>
+          </w:p>
+        </w:tc>
+      </w:tr>
+      <w:tr>
+        <w:tc>
+          <w:tcPr>
+            <w:tcW w:type="pct" w:w="33.333333333333336%"/>
+            <w:shd w:fill="FFFFFF"/>
+            <w:tcMar>
+              <w:top w:type="dxa" w:w="100"/>
+              <w:left w:type="dxa" w:w="100"/>
+              <w:bottom w:type="dxa" w:w="100"/>
+              <w:right w:type="dxa" w:w="100"/>
+            </w:tcMar>
+            <w:vAlign w:val="center"/>
+          </w:tcPr>
+          <w:p>
+            <w:r>
+              <w:rPr>
+                <w:b w:val="false"/>
+                <w:bCs w:val="false"/>
+                <w:sz w:val="22"/>
+                <w:szCs w:val="22"/>
+              </w:rPr>
+              <w:t xml:space="preserve">**Pricing**</w:t>
+            </w:r>
+          </w:p>
+        </w:tc>
+        <w:tc>
+          <w:tcPr>
+            <w:tcW w:type="pct" w:w="33.333333333333336%"/>
+            <w:shd w:fill="FFFFFF"/>
+            <w:tcMar>
+              <w:top w:type="dxa" w:w="100"/>
+              <w:left w:type="dxa" w:w="100"/>
+              <w:bottom w:type="dxa" w:w="100"/>
+              <w:right w:type="dxa" w:w="100"/>
+            </w:tcMar>
+            <w:vAlign w:val="center"/>
+          </w:tcPr>
+          <w:p>
+            <w:r>
+              <w:rPr>
+                <w:b w:val="false"/>
+                <w:bCs w:val="false"/>
+                <w:sz w:val="22"/>
+                <w:szCs w:val="22"/>
+              </w:rPr>
+              <w:t xml:space="preserve">Monthly/annual subscription fees</w:t>
+            </w:r>
+          </w:p>
+        </w:tc>
+        <w:tc>
+          <w:tcPr>
+            <w:tcW w:type="pct" w:w="33.333333333333336%"/>
+            <w:shd w:fill="FFFFFF"/>
+            <w:tcMar>
+              <w:top w:type="dxa" w:w="100"/>
+              <w:left w:type="dxa" w:w="100"/>
+              <w:bottom w:type="dxa" w:w="100"/>
+              <w:right w:type="dxa" w:w="100"/>
+            </w:tcMar>
+            <w:vAlign w:val="center"/>
+          </w:tcPr>
+          <w:p>
+            <w:r>
+              <w:rPr>
+                <w:b w:val="false"/>
+                <w:bCs w:val="false"/>
+                <w:sz w:val="22"/>
+                <w:szCs w:val="22"/>
+              </w:rPr>
+              <w:t xml:space="preserve">No subscription (founder status)</w:t>
+            </w:r>
+          </w:p>
+        </w:tc>
+      </w:tr>
+      <w:tr>
+        <w:tc>
+          <w:tcPr>
+            <w:tcW w:type="pct" w:w="33.333333333333336%"/>
+            <w:shd w:fill="FFFFFF"/>
+            <w:tcMar>
+              <w:top w:type="dxa" w:w="100"/>
+              <w:left w:type="dxa" w:w="100"/>
+              <w:bottom w:type="dxa" w:w="100"/>
+              <w:right w:type="dxa" w:w="100"/>
+            </w:tcMar>
+            <w:vAlign w:val="center"/>
+          </w:tcPr>
+          <w:p>
+            <w:r>
+              <w:rPr>
+                <w:b w:val="false"/>
+                <w:bCs w:val="false"/>
+                <w:sz w:val="22"/>
+                <w:szCs w:val="22"/>
+              </w:rPr>
+              <w:t xml:space="preserve">**Member Management**</w:t>
+            </w:r>
+          </w:p>
+        </w:tc>
+        <w:tc>
+          <w:tcPr>
+            <w:tcW w:type="pct" w:w="33.333333333333336%"/>
+            <w:shd w:fill="FFFFFF"/>
+            <w:tcMar>
+              <w:top w:type="dxa" w:w="100"/>
+              <w:left w:type="dxa" w:w="100"/>
+              <w:bottom w:type="dxa" w:w="100"/>
+              <w:right w:type="dxa" w:w="100"/>
+            </w:tcMar>
+            <w:vAlign w:val="center"/>
+          </w:tcPr>
+          <w:p>
+            <w:r>
+              <w:rPr>
+                <w:b w:val="false"/>
+                <w:bCs w:val="false"/>
+                <w:sz w:val="22"/>
+                <w:szCs w:val="22"/>
+              </w:rPr>
+              <w:t xml:space="preserve">Cannot manage other members</w:t>
+            </w:r>
+          </w:p>
+        </w:tc>
+        <w:tc>
+          <w:tcPr>
+            <w:tcW w:type="pct" w:w="33.333333333333336%"/>
+            <w:shd w:fill="FFFFFF"/>
+            <w:tcMar>
+              <w:top w:type="dxa" w:w="100"/>
+              <w:left w:type="dxa" w:w="100"/>
+              <w:bottom w:type="dxa" w:w="100"/>
+              <w:right w:type="dxa" w:w="100"/>
+            </w:tcMar>
+            <w:vAlign w:val="center"/>
+          </w:tcPr>
+          <w:p>
+            <w:r>
+              <w:rPr>
+                <w:b w:val="false"/>
+                <w:bCs w:val="false"/>
+                <w:sz w:val="22"/>
+                <w:szCs w:val="22"/>
+              </w:rPr>
+              <w:t xml:space="preserve">Can manage consortium members</w:t>
+            </w:r>
+          </w:p>
+        </w:tc>
+      </w:tr>
+      <w:tr>
+        <w:tc>
+          <w:tcPr>
+            <w:tcW w:type="pct" w:w="33.333333333333336%"/>
+            <w:shd w:fill="FFFFFF"/>
+            <w:tcMar>
+              <w:top w:type="dxa" w:w="100"/>
+              <w:left w:type="dxa" w:w="100"/>
+              <w:bottom w:type="dxa" w:w="100"/>
+              <w:right w:type="dxa" w:w="100"/>
+            </w:tcMar>
+            <w:vAlign w:val="center"/>
+          </w:tcPr>
+          <w:p>
+            <w:r>
+              <w:rPr>
+                <w:b w:val="false"/>
+                <w:bCs w:val="false"/>
+                <w:sz w:val="22"/>
+                <w:szCs w:val="22"/>
+              </w:rPr>
+              <w:t xml:space="preserve">**Support**</w:t>
+            </w:r>
+          </w:p>
+        </w:tc>
+        <w:tc>
+          <w:tcPr>
+            <w:tcW w:type="pct" w:w="33.333333333333336%"/>
+            <w:shd w:fill="FFFFFF"/>
+            <w:tcMar>
+              <w:top w:type="dxa" w:w="100"/>
+              <w:left w:type="dxa" w:w="100"/>
+              <w:bottom w:type="dxa" w:w="100"/>
+              <w:right w:type="dxa" w:w="100"/>
+            </w:tcMar>
+            <w:vAlign w:val="center"/>
+          </w:tcPr>
+          <w:p>
+            <w:r>
+              <w:rPr>
+                <w:b w:val="false"/>
+                <w:bCs w:val="false"/>
+                <w:sz w:val="22"/>
+                <w:szCs w:val="22"/>
+              </w:rPr>
+              <w:t xml:space="preserve">General consortium support</w:t>
+            </w:r>
+          </w:p>
+        </w:tc>
+        <w:tc>
+          <w:tcPr>
+            <w:tcW w:type="pct" w:w="33.333333333333336%"/>
+            <w:shd w:fill="FFFFFF"/>
+            <w:tcMar>
+              <w:top w:type="dxa" w:w="100"/>
+              <w:left w:type="dxa" w:w="100"/>
+              <w:bottom w:type="dxa" w:w="100"/>
+              <w:right w:type="dxa" w:w="100"/>
+            </w:tcMar>
+            <w:vAlign w:val="center"/>
+          </w:tcPr>
+          <w:p>
+            <w:r>
+              <w:rPr>
+                <w:b w:val="false"/>
+                <w:bCs w:val="false"/>
+                <w:sz w:val="22"/>
+                <w:szCs w:val="22"/>
+              </w:rPr>
+              <w:t xml:space="preserve">Founder-specific support</w:t>
+            </w:r>
+          </w:p>
+        </w:tc>
+      </w:tr>
+    </w:tbl>
     <w:p>
       <w:pPr>
         <w:pBdr>

</xml_diff>